<commit_message>
enviando arquivos atualizados e recentes das UCs, além de demais atividades realizadas durante o tempo
</commit_message>
<xml_diff>
--- a/Desenvolvimento de Sistemas Senac/UC2- Isabella/Atividades/Curso DS- Atividade Manual One Drive (13 05 2025).docx
+++ b/Desenvolvimento de Sistemas Senac/UC2- Isabella/Atividades/Curso DS- Atividade Manual One Drive (13 05 2025).docx
@@ -32,8 +32,9 @@
           <w:i/>
           <w:iCs/>
         </w:rPr>
-        <w:t xml:space="preserve"> no</w:t>
-      </w:r>
+        <w:t xml:space="preserve"> </w:t>
+      </w:r>
+      <w:proofErr w:type="gramStart"/>
       <w:r>
         <w:rPr>
           <w:rFonts w:ascii="Aptos Black" w:hAnsi="Aptos Black"/>
@@ -42,8 +43,9 @@
           <w:i/>
           <w:iCs/>
         </w:rPr>
-        <w:t xml:space="preserve"> OneDrive</w:t>
-      </w:r>
+        <w:t>no  OneDrive</w:t>
+      </w:r>
+      <w:proofErr w:type="gramEnd"/>
     </w:p>
     <w:p>
       <w:pPr>
@@ -243,15 +245,6 @@
     <w:p>
       <w:pPr>
         <w:spacing w:before="240" w:after="240"/>
-        <w:ind w:firstLine="708"/>
-        <w:rPr>
-          <w:rFonts w:ascii="Aptos" w:eastAsia="Aptos" w:hAnsi="Aptos" w:cs="Aptos"/>
-        </w:rPr>
-      </w:pPr>
-    </w:p>
-    <w:p>
-      <w:pPr>
-        <w:spacing w:before="240" w:after="240"/>
         <w:rPr>
           <w:rFonts w:ascii="Aptos" w:eastAsia="Aptos" w:hAnsi="Aptos" w:cs="Aptos"/>
         </w:rPr>
@@ -273,6 +266,7 @@
           <w:b/>
           <w:bCs/>
         </w:rPr>
+        <w:lastRenderedPageBreak/>
         <w:t>b</w:t>
       </w:r>
       <w:r>
@@ -388,7 +382,6 @@
         <w:rPr>
           <w:noProof/>
         </w:rPr>
-        <w:lastRenderedPageBreak/>
         <w:drawing>
           <wp:anchor distT="0" distB="0" distL="114300" distR="114300" simplePos="0" relativeHeight="251658240" behindDoc="0" locked="0" layoutInCell="1" allowOverlap="1" wp14:anchorId="7EDE5DC1" wp14:editId="3B320354">
             <wp:simplePos x="0" y="0"/>
@@ -575,16 +568,13 @@
     <w:p>
       <w:pPr>
         <w:spacing w:before="240" w:after="240"/>
+      </w:pPr>
+      <w:r>
         <w:rPr>
           <w:rFonts w:ascii="Aptos" w:eastAsia="Aptos" w:hAnsi="Aptos" w:cs="Aptos"/>
           <w:b/>
         </w:rPr>
-      </w:pPr>
-      <w:r>
-        <w:rPr>
-          <w:rFonts w:ascii="Aptos" w:eastAsia="Aptos" w:hAnsi="Aptos" w:cs="Aptos"/>
-          <w:b/>
-        </w:rPr>
+        <w:lastRenderedPageBreak/>
         <w:t>2º: Criar arquivo em branco</w:t>
       </w:r>
     </w:p>
@@ -598,20 +588,163 @@
         <w:spacing w:before="240" w:after="240"/>
         <w:rPr>
           <w:rFonts w:ascii="Aptos" w:eastAsia="Aptos" w:hAnsi="Aptos" w:cs="Aptos"/>
+        </w:rPr>
+      </w:pPr>
+      <w:r>
+        <w:rPr>
+          <w:rFonts w:ascii="Aptos" w:eastAsia="Aptos" w:hAnsi="Aptos" w:cs="Aptos"/>
+        </w:rPr>
+        <w:t xml:space="preserve">Clicar em </w:t>
+      </w:r>
+      <w:r>
+        <w:rPr>
+          <w:rFonts w:ascii="Aptos" w:eastAsia="Aptos" w:hAnsi="Aptos" w:cs="Aptos"/>
+        </w:rPr>
+        <w:t>“</w:t>
+      </w:r>
+      <w:r>
+        <w:rPr>
+          <w:rFonts w:ascii="Aptos" w:eastAsia="Aptos" w:hAnsi="Aptos" w:cs="Aptos"/>
+        </w:rPr>
+        <w:t xml:space="preserve">arquivo em </w:t>
+      </w:r>
+      <w:r>
+        <w:rPr>
+          <w:rFonts w:ascii="Aptos" w:eastAsia="Aptos" w:hAnsi="Aptos" w:cs="Aptos"/>
+        </w:rPr>
+        <w:t>branco</w:t>
+      </w:r>
+      <w:r>
+        <w:rPr>
+          <w:rFonts w:ascii="Aptos" w:eastAsia="Aptos" w:hAnsi="Aptos" w:cs="Aptos"/>
+        </w:rPr>
+        <w:t>”</w:t>
+      </w:r>
+      <w:r>
+        <w:rPr>
+          <w:rFonts w:ascii="Aptos" w:eastAsia="Aptos" w:hAnsi="Aptos" w:cs="Aptos"/>
+        </w:rPr>
+        <w:t xml:space="preserve"> </w:t>
+      </w:r>
+      <w:r>
+        <w:rPr>
+          <w:rFonts w:ascii="Aptos" w:eastAsia="Aptos" w:hAnsi="Aptos" w:cs="Aptos"/>
+        </w:rPr>
+        <w:t>para</w:t>
+      </w:r>
+      <w:r>
+        <w:rPr>
+          <w:rFonts w:ascii="Aptos" w:eastAsia="Aptos" w:hAnsi="Aptos" w:cs="Aptos"/>
+        </w:rPr>
+        <w:t xml:space="preserve"> criar um </w:t>
+      </w:r>
+      <w:r>
+        <w:rPr>
+          <w:rFonts w:ascii="Aptos" w:eastAsia="Aptos" w:hAnsi="Aptos" w:cs="Aptos"/>
+        </w:rPr>
+        <w:t>arquivo</w:t>
+      </w:r>
+      <w:r>
+        <w:rPr>
+          <w:rFonts w:ascii="Aptos" w:eastAsia="Aptos" w:hAnsi="Aptos" w:cs="Aptos"/>
+        </w:rPr>
+        <w:t xml:space="preserve"> </w:t>
+      </w:r>
+      <w:r>
+        <w:rPr>
+          <w:rFonts w:ascii="Aptos" w:eastAsia="Aptos" w:hAnsi="Aptos" w:cs="Aptos"/>
+        </w:rPr>
+        <w:t>novo</w:t>
+      </w:r>
+    </w:p>
+    <w:p>
+      <w:pPr>
+        <w:pStyle w:val="PargrafodaLista"/>
+        <w:spacing w:before="240" w:after="240"/>
+        <w:ind w:left="708"/>
+        <w:rPr>
+          <w:rFonts w:ascii="Aptos" w:eastAsia="Aptos" w:hAnsi="Aptos" w:cs="Aptos"/>
+        </w:rPr>
+      </w:pPr>
+    </w:p>
+    <w:p>
+      <w:pPr>
+        <w:pStyle w:val="PargrafodaLista"/>
+        <w:spacing w:before="240" w:after="240"/>
+      </w:pPr>
+    </w:p>
+    <w:p>
+      <w:pPr>
+        <w:pStyle w:val="PargrafodaLista"/>
+        <w:spacing w:before="240" w:after="240"/>
+        <w:rPr>
+          <w:rFonts w:ascii="Aptos" w:eastAsia="Aptos" w:hAnsi="Aptos" w:cs="Aptos"/>
+        </w:rPr>
+      </w:pPr>
+      <w:r>
+        <w:rPr>
+          <w:noProof/>
+        </w:rPr>
+        <w:drawing>
+          <wp:inline distT="0" distB="0" distL="0" distR="0" wp14:anchorId="411FDBC4" wp14:editId="107A32A3">
+            <wp:extent cx="10846234" cy="2478155"/>
+            <wp:effectExtent l="0" t="0" r="0" b="0"/>
+            <wp:docPr id="1988418982" name="Imagem 1" descr="Interface gráfica do usuário, Aplicativo&#10;&#10;O conteúdo gerado por IA pode estar incorreto."/>
+            <wp:cNvGraphicFramePr>
+              <a:graphicFrameLocks xmlns:a="http://schemas.openxmlformats.org/drawingml/2006/main" noChangeAspect="1"/>
+            </wp:cNvGraphicFramePr>
+            <a:graphic xmlns:a="http://schemas.openxmlformats.org/drawingml/2006/main">
+              <a:graphicData uri="http://schemas.openxmlformats.org/drawingml/2006/picture">
+                <pic:pic xmlns:pic="http://schemas.openxmlformats.org/drawingml/2006/picture">
+                  <pic:nvPicPr>
+                    <pic:cNvPr id="0" name="Imagem 1"/>
+                    <pic:cNvPicPr/>
+                  </pic:nvPicPr>
+                  <pic:blipFill>
+                    <a:blip r:embed="rId10">
+                      <a:extLst>
+                        <a:ext uri="{28A0092B-C50C-407E-A947-70E740481C1C}">
+                          <a14:useLocalDpi xmlns:a14="http://schemas.microsoft.com/office/drawing/2010/main" val="0"/>
+                        </a:ext>
+                      </a:extLst>
+                    </a:blip>
+                    <a:stretch>
+                      <a:fillRect/>
+                    </a:stretch>
+                  </pic:blipFill>
+                  <pic:spPr>
+                    <a:xfrm>
+                      <a:off x="0" y="0"/>
+                      <a:ext cx="10846234" cy="2478155"/>
+                    </a:xfrm>
+                    <a:prstGeom prst="rect">
+                      <a:avLst/>
+                    </a:prstGeom>
+                  </pic:spPr>
+                </pic:pic>
+              </a:graphicData>
+            </a:graphic>
+          </wp:inline>
+        </w:drawing>
+      </w:r>
+    </w:p>
+    <w:p>
+      <w:pPr>
+        <w:spacing w:before="240" w:after="240"/>
+        <w:rPr>
+          <w:rFonts w:ascii="Aptos" w:eastAsia="Aptos" w:hAnsi="Aptos" w:cs="Aptos"/>
           <w:b/>
           <w:bCs/>
         </w:rPr>
       </w:pPr>
-      <w:r>
-        <w:rPr>
-          <w:rFonts w:ascii="Aptos" w:eastAsia="Aptos" w:hAnsi="Aptos" w:cs="Aptos"/>
-        </w:rPr>
-        <w:t>Se tiver alguma mensagem que seja necessário aceitar os termos, como essa em baixo, aceite para continuar</w:t>
-      </w:r>
     </w:p>
     <w:p>
       <w:pPr>
         <w:pStyle w:val="PargrafodaLista"/>
+        <w:numPr>
+          <w:ilvl w:val="0"/>
+          <w:numId w:val="1"/>
+        </w:numPr>
         <w:spacing w:before="240" w:after="240"/>
         <w:rPr>
           <w:rFonts w:ascii="Aptos" w:eastAsia="Aptos" w:hAnsi="Aptos" w:cs="Aptos"/>
@@ -619,6 +752,18 @@
           <w:bCs/>
         </w:rPr>
       </w:pPr>
+      <w:r>
+        <w:rPr>
+          <w:rFonts w:ascii="Aptos" w:eastAsia="Aptos" w:hAnsi="Aptos" w:cs="Aptos"/>
+        </w:rPr>
+        <w:t xml:space="preserve">Se tiver alguma mensagem que </w:t>
+      </w:r>
+      <w:r>
+        <w:rPr>
+          <w:rFonts w:ascii="Aptos" w:eastAsia="Aptos" w:hAnsi="Aptos" w:cs="Aptos"/>
+        </w:rPr>
+        <w:t>seja necessário aceitar os termos, como essa em baixo, aceite para continuar</w:t>
+      </w:r>
     </w:p>
     <w:p>
       <w:pPr>
@@ -630,13 +775,23 @@
           <w:bCs/>
         </w:rPr>
       </w:pPr>
+    </w:p>
+    <w:p>
+      <w:pPr>
+        <w:pStyle w:val="PargrafodaLista"/>
+        <w:spacing w:before="240" w:after="240"/>
+        <w:rPr>
+          <w:rFonts w:ascii="Aptos" w:eastAsia="Aptos" w:hAnsi="Aptos" w:cs="Aptos"/>
+          <w:b/>
+          <w:bCs/>
+        </w:rPr>
+      </w:pPr>
       <w:r>
         <w:rPr>
           <w:noProof/>
         </w:rPr>
-        <w:lastRenderedPageBreak/>
         <w:drawing>
-          <wp:inline distT="0" distB="0" distL="0" distR="0" wp14:anchorId="4C17087B" wp14:editId="2AAD3159">
+          <wp:inline distT="0" distB="0" distL="0" distR="0" wp14:anchorId="717FF023" wp14:editId="7C2833D6">
             <wp:extent cx="4638675" cy="3134815"/>
             <wp:effectExtent l="0" t="0" r="0" b="8890"/>
             <wp:docPr id="763829241" name="Imagem 1" descr="Tutorial: Remover Licença Office ProPlus de uma estação de trabalho"/>
@@ -653,7 +808,7 @@
                     </pic:cNvPicPr>
                   </pic:nvPicPr>
                   <pic:blipFill>
-                    <a:blip r:embed="rId10">
+                    <a:blip r:embed="rId11">
                       <a:extLst>
                         <a:ext uri="{28A0092B-C50C-407E-A947-70E740481C1C}">
                           <a14:useLocalDpi xmlns:a14="http://schemas.microsoft.com/office/drawing/2010/main" val="0"/>
@@ -687,7 +842,6 @@
     </w:p>
     <w:p>
       <w:pPr>
-        <w:pStyle w:val="PargrafodaLista"/>
         <w:spacing w:before="240" w:after="240"/>
         <w:rPr>
           <w:rFonts w:ascii="Aptos" w:eastAsia="Aptos" w:hAnsi="Aptos" w:cs="Aptos"/>
@@ -698,9 +852,30 @@
     </w:p>
     <w:p>
       <w:pPr>
-        <w:pStyle w:val="PargrafodaLista"/>
-        <w:spacing w:before="240" w:after="240"/>
-      </w:pPr>
+        <w:spacing w:before="240" w:after="240"/>
+        <w:rPr>
+          <w:rFonts w:ascii="Aptos" w:eastAsia="Aptos" w:hAnsi="Aptos" w:cs="Aptos"/>
+          <w:b/>
+          <w:bCs/>
+        </w:rPr>
+      </w:pPr>
+    </w:p>
+    <w:p>
+      <w:pPr>
+        <w:spacing w:before="240" w:after="240"/>
+        <w:rPr>
+          <w:rFonts w:ascii="Aptos" w:eastAsia="Aptos" w:hAnsi="Aptos" w:cs="Aptos"/>
+          <w:b/>
+        </w:rPr>
+      </w:pPr>
+      <w:r>
+        <w:rPr>
+          <w:rFonts w:ascii="Aptos" w:eastAsia="Aptos" w:hAnsi="Aptos" w:cs="Aptos"/>
+          <w:b/>
+        </w:rPr>
+        <w:lastRenderedPageBreak/>
+        <w:t>3º: Para Salvar um Arquivo:</w:t>
+      </w:r>
     </w:p>
     <w:p>
       <w:pPr>
@@ -718,25 +893,31 @@
         <w:rPr>
           <w:rFonts w:ascii="Aptos" w:eastAsia="Aptos" w:hAnsi="Aptos" w:cs="Aptos"/>
         </w:rPr>
-        <w:t xml:space="preserve">Clicar em </w:t>
-      </w:r>
-      <w:r>
-        <w:rPr>
-          <w:rFonts w:ascii="Aptos" w:eastAsia="Aptos" w:hAnsi="Aptos" w:cs="Aptos"/>
-        </w:rPr>
-        <w:t>“</w:t>
-      </w:r>
-      <w:r>
-        <w:rPr>
-          <w:rFonts w:ascii="Aptos" w:eastAsia="Aptos" w:hAnsi="Aptos" w:cs="Aptos"/>
-        </w:rPr>
-        <w:t xml:space="preserve">arquivo em </w:t>
-      </w:r>
-      <w:r>
-        <w:rPr>
-          <w:rFonts w:ascii="Aptos" w:eastAsia="Aptos" w:hAnsi="Aptos" w:cs="Aptos"/>
-        </w:rPr>
-        <w:t>branco</w:t>
+        <w:t>Com o arquivo Word aberto</w:t>
+      </w:r>
+      <w:r>
+        <w:rPr>
+          <w:rFonts w:ascii="Aptos" w:eastAsia="Aptos" w:hAnsi="Aptos" w:cs="Aptos"/>
+        </w:rPr>
+        <w:t>, c</w:t>
+      </w:r>
+      <w:r>
+        <w:rPr>
+          <w:rFonts w:ascii="Aptos" w:eastAsia="Aptos" w:hAnsi="Aptos" w:cs="Aptos"/>
+        </w:rPr>
+        <w:t xml:space="preserve">licar na opção </w:t>
+      </w:r>
+      <w:r>
+        <w:rPr>
+          <w:rFonts w:ascii="Aptos" w:eastAsia="Aptos" w:hAnsi="Aptos" w:cs="Aptos"/>
+        </w:rPr>
+        <w:t>“A</w:t>
+      </w:r>
+      <w:r>
+        <w:rPr>
+          <w:rFonts w:ascii="Aptos" w:eastAsia="Aptos" w:hAnsi="Aptos" w:cs="Aptos"/>
+        </w:rPr>
+        <w:t>rquivo</w:t>
       </w:r>
       <w:r>
         <w:rPr>
@@ -748,52 +929,14 @@
         <w:rPr>
           <w:rFonts w:ascii="Aptos" w:eastAsia="Aptos" w:hAnsi="Aptos" w:cs="Aptos"/>
         </w:rPr>
-        <w:t xml:space="preserve"> </w:t>
-      </w:r>
-      <w:r>
-        <w:rPr>
-          <w:rFonts w:ascii="Aptos" w:eastAsia="Aptos" w:hAnsi="Aptos" w:cs="Aptos"/>
-        </w:rPr>
-        <w:t>para</w:t>
-      </w:r>
-      <w:r>
-        <w:rPr>
-          <w:rFonts w:ascii="Aptos" w:eastAsia="Aptos" w:hAnsi="Aptos" w:cs="Aptos"/>
-        </w:rPr>
-        <w:t xml:space="preserve"> criar um </w:t>
-      </w:r>
-      <w:r>
-        <w:rPr>
-          <w:rFonts w:ascii="Aptos" w:eastAsia="Aptos" w:hAnsi="Aptos" w:cs="Aptos"/>
-        </w:rPr>
-        <w:t>arquivo</w:t>
-      </w:r>
-      <w:r>
-        <w:rPr>
-          <w:rFonts w:ascii="Aptos" w:eastAsia="Aptos" w:hAnsi="Aptos" w:cs="Aptos"/>
-        </w:rPr>
-        <w:t xml:space="preserve"> </w:t>
-      </w:r>
-      <w:r>
-        <w:rPr>
-          <w:rFonts w:ascii="Aptos" w:eastAsia="Aptos" w:hAnsi="Aptos" w:cs="Aptos"/>
-        </w:rPr>
-        <w:t>novo</w:t>
+        <w:t xml:space="preserve"> no canto superior esquerdo</w:t>
       </w:r>
     </w:p>
     <w:p>
       <w:pPr>
         <w:pStyle w:val="PargrafodaLista"/>
         <w:spacing w:before="240" w:after="240"/>
-        <w:rPr>
-          <w:rFonts w:ascii="Aptos" w:eastAsia="Aptos" w:hAnsi="Aptos" w:cs="Aptos"/>
-        </w:rPr>
-      </w:pPr>
-    </w:p>
-    <w:p>
-      <w:pPr>
-        <w:pStyle w:val="PargrafodaLista"/>
-        <w:spacing w:before="240" w:after="240"/>
+        <w:ind w:left="1440"/>
         <w:rPr>
           <w:rFonts w:ascii="Aptos" w:eastAsia="Aptos" w:hAnsi="Aptos" w:cs="Aptos"/>
         </w:rPr>
@@ -802,164 +945,6 @@
         <w:rPr>
           <w:noProof/>
         </w:rPr>
-        <w:drawing>
-          <wp:inline distT="0" distB="0" distL="0" distR="0" wp14:anchorId="411FDBC4" wp14:editId="107A32A3">
-            <wp:extent cx="10846234" cy="2478155"/>
-            <wp:effectExtent l="0" t="0" r="0" b="0"/>
-            <wp:docPr id="1988418982" name="Imagem 1" descr="Interface gráfica do usuário, Aplicativo&#10;&#10;O conteúdo gerado por IA pode estar incorreto."/>
-            <wp:cNvGraphicFramePr>
-              <a:graphicFrameLocks xmlns:a="http://schemas.openxmlformats.org/drawingml/2006/main" noChangeAspect="1"/>
-            </wp:cNvGraphicFramePr>
-            <a:graphic xmlns:a="http://schemas.openxmlformats.org/drawingml/2006/main">
-              <a:graphicData uri="http://schemas.openxmlformats.org/drawingml/2006/picture">
-                <pic:pic xmlns:pic="http://schemas.openxmlformats.org/drawingml/2006/picture">
-                  <pic:nvPicPr>
-                    <pic:cNvPr id="0" name="Imagem 1"/>
-                    <pic:cNvPicPr/>
-                  </pic:nvPicPr>
-                  <pic:blipFill>
-                    <a:blip r:embed="rId11">
-                      <a:extLst>
-                        <a:ext uri="{28A0092B-C50C-407E-A947-70E740481C1C}">
-                          <a14:useLocalDpi xmlns:a14="http://schemas.microsoft.com/office/drawing/2010/main" val="0"/>
-                        </a:ext>
-                      </a:extLst>
-                    </a:blip>
-                    <a:stretch>
-                      <a:fillRect/>
-                    </a:stretch>
-                  </pic:blipFill>
-                  <pic:spPr>
-                    <a:xfrm>
-                      <a:off x="0" y="0"/>
-                      <a:ext cx="10846234" cy="2478155"/>
-                    </a:xfrm>
-                    <a:prstGeom prst="rect">
-                      <a:avLst/>
-                    </a:prstGeom>
-                  </pic:spPr>
-                </pic:pic>
-              </a:graphicData>
-            </a:graphic>
-          </wp:inline>
-        </w:drawing>
-      </w:r>
-    </w:p>
-    <w:p>
-      <w:pPr>
-        <w:spacing w:before="240" w:after="240"/>
-        <w:rPr>
-          <w:rFonts w:ascii="Aptos" w:eastAsia="Aptos" w:hAnsi="Aptos" w:cs="Aptos"/>
-          <w:b/>
-          <w:bCs/>
-        </w:rPr>
-      </w:pPr>
-    </w:p>
-    <w:p>
-      <w:pPr>
-        <w:spacing w:before="240" w:after="240"/>
-        <w:rPr>
-          <w:rFonts w:ascii="Aptos" w:eastAsia="Aptos" w:hAnsi="Aptos" w:cs="Aptos"/>
-          <w:b/>
-          <w:bCs/>
-        </w:rPr>
-      </w:pPr>
-    </w:p>
-    <w:p>
-      <w:pPr>
-        <w:spacing w:before="240" w:after="240"/>
-        <w:rPr>
-          <w:rFonts w:ascii="Aptos" w:eastAsia="Aptos" w:hAnsi="Aptos" w:cs="Aptos"/>
-          <w:b/>
-          <w:bCs/>
-        </w:rPr>
-      </w:pPr>
-    </w:p>
-    <w:p>
-      <w:pPr>
-        <w:spacing w:before="240" w:after="240"/>
-        <w:rPr>
-          <w:rFonts w:ascii="Aptos" w:eastAsia="Aptos" w:hAnsi="Aptos" w:cs="Aptos"/>
-          <w:b/>
-        </w:rPr>
-      </w:pPr>
-      <w:r>
-        <w:rPr>
-          <w:rFonts w:ascii="Aptos" w:eastAsia="Aptos" w:hAnsi="Aptos" w:cs="Aptos"/>
-          <w:b/>
-        </w:rPr>
-        <w:t>3º: Para Salvar um Arquivo:</w:t>
-      </w:r>
-    </w:p>
-    <w:p>
-      <w:pPr>
-        <w:pStyle w:val="PargrafodaLista"/>
-        <w:numPr>
-          <w:ilvl w:val="0"/>
-          <w:numId w:val="1"/>
-        </w:numPr>
-        <w:spacing w:before="240" w:after="240"/>
-        <w:rPr>
-          <w:rFonts w:ascii="Aptos" w:eastAsia="Aptos" w:hAnsi="Aptos" w:cs="Aptos"/>
-        </w:rPr>
-      </w:pPr>
-      <w:r>
-        <w:rPr>
-          <w:rFonts w:ascii="Aptos" w:eastAsia="Aptos" w:hAnsi="Aptos" w:cs="Aptos"/>
-        </w:rPr>
-        <w:t>Com o arquivo Word aberto</w:t>
-      </w:r>
-      <w:r>
-        <w:rPr>
-          <w:rFonts w:ascii="Aptos" w:eastAsia="Aptos" w:hAnsi="Aptos" w:cs="Aptos"/>
-        </w:rPr>
-        <w:t>, c</w:t>
-      </w:r>
-      <w:r>
-        <w:rPr>
-          <w:rFonts w:ascii="Aptos" w:eastAsia="Aptos" w:hAnsi="Aptos" w:cs="Aptos"/>
-        </w:rPr>
-        <w:t xml:space="preserve">licar na opção </w:t>
-      </w:r>
-      <w:r>
-        <w:rPr>
-          <w:rFonts w:ascii="Aptos" w:eastAsia="Aptos" w:hAnsi="Aptos" w:cs="Aptos"/>
-        </w:rPr>
-        <w:t>“A</w:t>
-      </w:r>
-      <w:r>
-        <w:rPr>
-          <w:rFonts w:ascii="Aptos" w:eastAsia="Aptos" w:hAnsi="Aptos" w:cs="Aptos"/>
-        </w:rPr>
-        <w:t>rquivo</w:t>
-      </w:r>
-      <w:r>
-        <w:rPr>
-          <w:rFonts w:ascii="Aptos" w:eastAsia="Aptos" w:hAnsi="Aptos" w:cs="Aptos"/>
-        </w:rPr>
-        <w:t>”</w:t>
-      </w:r>
-      <w:r>
-        <w:rPr>
-          <w:rFonts w:ascii="Aptos" w:eastAsia="Aptos" w:hAnsi="Aptos" w:cs="Aptos"/>
-        </w:rPr>
-        <w:t xml:space="preserve"> no canto superior esquerdo</w:t>
-      </w:r>
-    </w:p>
-    <w:p>
-      <w:pPr>
-        <w:pStyle w:val="PargrafodaLista"/>
-        <w:spacing w:before="240" w:after="240"/>
-        <w:ind w:left="1440"/>
-        <w:rPr>
-          <w:rFonts w:ascii="Aptos" w:eastAsia="Aptos" w:hAnsi="Aptos" w:cs="Aptos"/>
-        </w:rPr>
-      </w:pPr>
-      <w:r>
-        <w:rPr>
-          <w:noProof/>
-        </w:rPr>
-        <w:lastRenderedPageBreak/>
         <w:drawing>
           <wp:inline distT="0" distB="0" distL="0" distR="0" wp14:anchorId="11A41DFE" wp14:editId="36793C3D">
             <wp:extent cx="2809875" cy="1948180"/>
@@ -1091,7 +1076,7 @@
           <w:noProof/>
         </w:rPr>
         <w:drawing>
-          <wp:inline distT="0" distB="0" distL="0" distR="0" wp14:anchorId="4C84A9E0" wp14:editId="65F60094">
+          <wp:inline distT="0" distB="0" distL="0" distR="0" wp14:anchorId="4C84A9E0" wp14:editId="78FD5962">
             <wp:extent cx="4605344" cy="2738078"/>
             <wp:effectExtent l="0" t="0" r="0" b="8890"/>
             <wp:docPr id="84381321" name="Imagem 1" descr="Interface gráfica do usuário, Aplicativo&#10;&#10;O conteúdo gerado por IA pode estar incorreto."/>
@@ -1221,6 +1206,7 @@
         <w:rPr>
           <w:rFonts w:ascii="Aptos" w:eastAsia="Aptos" w:hAnsi="Aptos" w:cs="Aptos"/>
         </w:rPr>
+        <w:lastRenderedPageBreak/>
         <w:t>N</w:t>
       </w:r>
       <w:r>
@@ -1296,7 +1282,6 @@
         <w:rPr>
           <w:noProof/>
         </w:rPr>
-        <w:lastRenderedPageBreak/>
         <w:drawing>
           <wp:inline distT="0" distB="0" distL="0" distR="0" wp14:anchorId="780CF12F" wp14:editId="3585745D">
             <wp:extent cx="5400040" cy="1535430"/>
@@ -1633,6 +1618,7 @@
           <w:b/>
           <w:bCs/>
         </w:rPr>
+        <w:lastRenderedPageBreak/>
         <w:t>4</w:t>
       </w:r>
       <w:r>
@@ -1664,8 +1650,14 @@
           <w:rFonts w:ascii="Aptos" w:eastAsia="Aptos" w:hAnsi="Aptos" w:cs="Aptos"/>
           <w:b/>
         </w:rPr>
-        <w:lastRenderedPageBreak/>
-        <w:t xml:space="preserve">1) </w:t>
+        <w:t>a</w:t>
+      </w:r>
+      <w:r>
+        <w:rPr>
+          <w:rFonts w:ascii="Aptos" w:eastAsia="Aptos" w:hAnsi="Aptos" w:cs="Aptos"/>
+          <w:b/>
+        </w:rPr>
+        <w:t xml:space="preserve">) </w:t>
       </w:r>
       <w:r>
         <w:rPr>
@@ -1770,6 +1762,11 @@
     <w:p>
       <w:pPr>
         <w:pStyle w:val="PargrafodaLista"/>
+        <w:numPr>
+          <w:ilvl w:val="0"/>
+          <w:numId w:val="3"/>
+        </w:numPr>
+        <w:spacing w:before="240" w:after="240"/>
         <w:rPr>
           <w:rFonts w:ascii="Aptos" w:eastAsia="Aptos" w:hAnsi="Aptos" w:cs="Aptos"/>
         </w:rPr>
@@ -1804,7 +1801,7 @@
           <w:noProof/>
         </w:rPr>
         <w:drawing>
-          <wp:inline distT="0" distB="0" distL="0" distR="0" wp14:anchorId="2A451CC9" wp14:editId="7D685A9C">
+          <wp:inline distT="0" distB="0" distL="0" distR="0" wp14:anchorId="2A451CC9" wp14:editId="18011CFB">
             <wp:extent cx="182880" cy="194945"/>
             <wp:effectExtent l="0" t="0" r="7620" b="0"/>
             <wp:docPr id="570561905" name="Imagem 1"/>
@@ -1943,7 +1940,54 @@
         <w:rPr>
           <w:rFonts w:ascii="Aptos" w:eastAsia="Aptos" w:hAnsi="Aptos" w:cs="Aptos"/>
         </w:rPr>
-        <w:t xml:space="preserve"> até a nuvem </w:t>
+        <w:t xml:space="preserve"> até a nuvem</w:t>
+      </w:r>
+      <w:r>
+        <w:rPr>
+          <w:rFonts w:ascii="Aptos" w:eastAsia="Aptos" w:hAnsi="Aptos" w:cs="Aptos"/>
+          <w:noProof/>
+        </w:rPr>
+        <w:drawing>
+          <wp:inline distT="0" distB="0" distL="0" distR="0" wp14:anchorId="0E1DA1DE" wp14:editId="21D76DDC">
+            <wp:extent cx="209579" cy="228632"/>
+            <wp:effectExtent l="0" t="0" r="0" b="0"/>
+            <wp:docPr id="47959215" name="Imagem 1"/>
+            <wp:cNvGraphicFramePr>
+              <a:graphicFrameLocks xmlns:a="http://schemas.openxmlformats.org/drawingml/2006/main" noChangeAspect="1"/>
+            </wp:cNvGraphicFramePr>
+            <a:graphic xmlns:a="http://schemas.openxmlformats.org/drawingml/2006/main">
+              <a:graphicData uri="http://schemas.openxmlformats.org/drawingml/2006/picture">
+                <pic:pic xmlns:pic="http://schemas.openxmlformats.org/drawingml/2006/picture">
+                  <pic:nvPicPr>
+                    <pic:cNvPr id="1353351107" name=""/>
+                    <pic:cNvPicPr/>
+                  </pic:nvPicPr>
+                  <pic:blipFill>
+                    <a:blip r:embed="rId20"/>
+                    <a:stretch>
+                      <a:fillRect/>
+                    </a:stretch>
+                  </pic:blipFill>
+                  <pic:spPr>
+                    <a:xfrm>
+                      <a:off x="0" y="0"/>
+                      <a:ext cx="209579" cy="228632"/>
+                    </a:xfrm>
+                    <a:prstGeom prst="rect">
+                      <a:avLst/>
+                    </a:prstGeom>
+                  </pic:spPr>
+                </pic:pic>
+              </a:graphicData>
+            </a:graphic>
+          </wp:inline>
+        </w:drawing>
+      </w:r>
+      <w:r>
+        <w:rPr>
+          <w:rFonts w:ascii="Aptos" w:eastAsia="Aptos" w:hAnsi="Aptos" w:cs="Aptos"/>
+        </w:rPr>
+        <w:t xml:space="preserve"> </w:t>
       </w:r>
       <w:r>
         <w:rPr>
@@ -1951,26 +1995,12 @@
         </w:rPr>
         <w:t xml:space="preserve">do </w:t>
       </w:r>
-      <w:proofErr w:type="spellStart"/>
-      <w:r>
-        <w:rPr>
-          <w:rFonts w:ascii="Aptos" w:eastAsia="Aptos" w:hAnsi="Aptos" w:cs="Aptos"/>
-        </w:rPr>
-        <w:t>On</w:t>
-      </w:r>
-      <w:r>
-        <w:rPr>
-          <w:rFonts w:ascii="Aptos" w:eastAsia="Aptos" w:hAnsi="Aptos" w:cs="Aptos"/>
-        </w:rPr>
-        <w:t>e</w:t>
-      </w:r>
-      <w:r>
-        <w:rPr>
-          <w:rFonts w:ascii="Aptos" w:eastAsia="Aptos" w:hAnsi="Aptos" w:cs="Aptos"/>
-        </w:rPr>
-        <w:t>eDrive</w:t>
-      </w:r>
-      <w:proofErr w:type="spellEnd"/>
+      <w:r>
+        <w:rPr>
+          <w:rFonts w:ascii="Aptos" w:eastAsia="Aptos" w:hAnsi="Aptos" w:cs="Aptos"/>
+        </w:rPr>
+        <w:t>OneDrive</w:t>
+      </w:r>
       <w:r>
         <w:rPr>
           <w:rFonts w:ascii="Aptos" w:eastAsia="Aptos" w:hAnsi="Aptos" w:cs="Aptos"/>
@@ -2117,6 +2147,79 @@
         <w:rPr>
           <w:noProof/>
         </w:rPr>
+        <mc:AlternateContent>
+          <mc:Choice Requires="wps">
+            <w:drawing>
+              <wp:anchor distT="0" distB="0" distL="114300" distR="114300" simplePos="0" relativeHeight="251659264" behindDoc="0" locked="0" layoutInCell="1" allowOverlap="1" wp14:anchorId="14332DEB" wp14:editId="577C1A4F">
+                <wp:simplePos x="0" y="0"/>
+                <wp:positionH relativeFrom="column">
+                  <wp:posOffset>720090</wp:posOffset>
+                </wp:positionH>
+                <wp:positionV relativeFrom="paragraph">
+                  <wp:posOffset>774065</wp:posOffset>
+                </wp:positionV>
+                <wp:extent cx="495300" cy="152400"/>
+                <wp:effectExtent l="38100" t="0" r="19050" b="76200"/>
+                <wp:wrapNone/>
+                <wp:docPr id="538733062" name="Conector de Seta Reta 2"/>
+                <wp:cNvGraphicFramePr/>
+                <a:graphic xmlns:a="http://schemas.openxmlformats.org/drawingml/2006/main">
+                  <a:graphicData uri="http://schemas.microsoft.com/office/word/2010/wordprocessingShape">
+                    <wps:wsp>
+                      <wps:cNvCnPr/>
+                      <wps:spPr>
+                        <a:xfrm flipH="1">
+                          <a:off x="0" y="0"/>
+                          <a:ext cx="495300" cy="152400"/>
+                        </a:xfrm>
+                        <a:prstGeom prst="straightConnector1">
+                          <a:avLst/>
+                        </a:prstGeom>
+                        <a:ln>
+                          <a:solidFill>
+                            <a:srgbClr val="FF0000"/>
+                          </a:solidFill>
+                          <a:tailEnd type="triangle"/>
+                        </a:ln>
+                      </wps:spPr>
+                      <wps:style>
+                        <a:lnRef idx="2">
+                          <a:schemeClr val="accent1"/>
+                        </a:lnRef>
+                        <a:fillRef idx="0">
+                          <a:schemeClr val="accent1"/>
+                        </a:fillRef>
+                        <a:effectRef idx="1">
+                          <a:schemeClr val="accent1"/>
+                        </a:effectRef>
+                        <a:fontRef idx="minor">
+                          <a:schemeClr val="tx1"/>
+                        </a:fontRef>
+                      </wps:style>
+                      <wps:bodyPr/>
+                    </wps:wsp>
+                  </a:graphicData>
+                </a:graphic>
+              </wp:anchor>
+            </w:drawing>
+          </mc:Choice>
+          <mc:Fallback>
+            <w:pict>
+              <v:shapetype w14:anchorId="3E6AD5B3" id="_x0000_t32" coordsize="21600,21600" o:spt="32" o:oned="t" path="m,l21600,21600e" filled="f">
+                <v:path arrowok="t" fillok="f" o:connecttype="none"/>
+                <o:lock v:ext="edit" shapetype="t"/>
+              </v:shapetype>
+              <v:shape id="Conector de Seta Reta 2" o:spid="_x0000_s1026" type="#_x0000_t32" style="position:absolute;margin-left:56.7pt;margin-top:60.95pt;width:39pt;height:12pt;flip:x;z-index:251659264;visibility:visible;mso-wrap-style:square;mso-wrap-distance-left:9pt;mso-wrap-distance-top:0;mso-wrap-distance-right:9pt;mso-wrap-distance-bottom:0;mso-position-horizontal:absolute;mso-position-horizontal-relative:text;mso-position-vertical:absolute;mso-position-vertical-relative:text" o:gfxdata="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" strokecolor="red" strokeweight="1.5pt">
+                <v:stroke endarrow="block" joinstyle="miter"/>
+              </v:shape>
+            </w:pict>
+          </mc:Fallback>
+        </mc:AlternateContent>
+      </w:r>
+      <w:r>
+        <w:rPr>
+          <w:noProof/>
+        </w:rPr>
         <w:drawing>
           <wp:inline distT="0" distB="0" distL="0" distR="0" wp14:anchorId="72AB731E" wp14:editId="4D3F6BB3">
             <wp:extent cx="4646092" cy="2607734"/>
@@ -2133,7 +2236,7 @@
                     <pic:cNvPicPr/>
                   </pic:nvPicPr>
                   <pic:blipFill>
-                    <a:blip r:embed="rId20">
+                    <a:blip r:embed="rId21">
                       <a:extLst>
                         <a:ext uri="{28A0092B-C50C-407E-A947-70E740481C1C}">
                           <a14:useLocalDpi xmlns:a14="http://schemas.microsoft.com/office/drawing/2010/main" val="0"/>
@@ -2183,7 +2286,16 @@
           <w:b/>
           <w:bCs/>
         </w:rPr>
-        <w:t>2) Segundo Jeito</w:t>
+        <w:lastRenderedPageBreak/>
+        <w:t>b</w:t>
+      </w:r>
+      <w:r>
+        <w:rPr>
+          <w:rFonts w:ascii="Aptos" w:eastAsia="Aptos" w:hAnsi="Aptos" w:cs="Aptos"/>
+          <w:b/>
+          <w:bCs/>
+        </w:rPr>
+        <w:t>) Segundo Jeito</w:t>
       </w:r>
     </w:p>
     <w:p>
@@ -2202,7 +2314,6 @@
         <w:rPr>
           <w:rFonts w:ascii="Aptos" w:eastAsia="Aptos" w:hAnsi="Aptos" w:cs="Aptos"/>
         </w:rPr>
-        <w:lastRenderedPageBreak/>
         <w:t>Abrir o explorador de arquivos</w:t>
       </w:r>
       <w:r>
@@ -2326,13 +2437,60 @@
         <w:rPr>
           <w:rFonts w:ascii="Aptos" w:eastAsia="Aptos" w:hAnsi="Aptos" w:cs="Aptos"/>
         </w:rPr>
-        <w:t xml:space="preserve">e arrastar até a nuvem no </w:t>
-      </w:r>
-      <w:r>
-        <w:rPr>
-          <w:rFonts w:ascii="Aptos" w:eastAsia="Aptos" w:hAnsi="Aptos" w:cs="Aptos"/>
-        </w:rPr>
-        <w:t>explorador</w:t>
+        <w:t>e arrastar até a nuvem</w:t>
+      </w:r>
+      <w:r>
+        <w:rPr>
+          <w:rFonts w:ascii="Aptos" w:eastAsia="Aptos" w:hAnsi="Aptos" w:cs="Aptos"/>
+          <w:noProof/>
+        </w:rPr>
+        <w:drawing>
+          <wp:inline distT="0" distB="0" distL="0" distR="0" wp14:anchorId="6DB22D1C" wp14:editId="67798168">
+            <wp:extent cx="209579" cy="228632"/>
+            <wp:effectExtent l="0" t="0" r="0" b="0"/>
+            <wp:docPr id="2136984692" name="Imagem 1"/>
+            <wp:cNvGraphicFramePr>
+              <a:graphicFrameLocks xmlns:a="http://schemas.openxmlformats.org/drawingml/2006/main" noChangeAspect="1"/>
+            </wp:cNvGraphicFramePr>
+            <a:graphic xmlns:a="http://schemas.openxmlformats.org/drawingml/2006/main">
+              <a:graphicData uri="http://schemas.openxmlformats.org/drawingml/2006/picture">
+                <pic:pic xmlns:pic="http://schemas.openxmlformats.org/drawingml/2006/picture">
+                  <pic:nvPicPr>
+                    <pic:cNvPr id="1353351107" name=""/>
+                    <pic:cNvPicPr/>
+                  </pic:nvPicPr>
+                  <pic:blipFill>
+                    <a:blip r:embed="rId20"/>
+                    <a:stretch>
+                      <a:fillRect/>
+                    </a:stretch>
+                  </pic:blipFill>
+                  <pic:spPr>
+                    <a:xfrm>
+                      <a:off x="0" y="0"/>
+                      <a:ext cx="209579" cy="228632"/>
+                    </a:xfrm>
+                    <a:prstGeom prst="rect">
+                      <a:avLst/>
+                    </a:prstGeom>
+                  </pic:spPr>
+                </pic:pic>
+              </a:graphicData>
+            </a:graphic>
+          </wp:inline>
+        </w:drawing>
+      </w:r>
+      <w:r>
+        <w:rPr>
+          <w:rFonts w:ascii="Aptos" w:eastAsia="Aptos" w:hAnsi="Aptos" w:cs="Aptos"/>
+        </w:rPr>
+        <w:t xml:space="preserve"> no explorado</w:t>
+      </w:r>
+      <w:r>
+        <w:rPr>
+          <w:rFonts w:ascii="Aptos" w:eastAsia="Aptos" w:hAnsi="Aptos" w:cs="Aptos"/>
+        </w:rPr>
+        <w:t>r</w:t>
       </w:r>
       <w:r>
         <w:rPr>
@@ -2352,8 +2510,77 @@
         <w:rPr>
           <w:noProof/>
         </w:rPr>
+        <mc:AlternateContent>
+          <mc:Choice Requires="wps">
+            <w:drawing>
+              <wp:anchor distT="0" distB="0" distL="114300" distR="114300" simplePos="0" relativeHeight="251660288" behindDoc="0" locked="0" layoutInCell="1" allowOverlap="1" wp14:anchorId="33570542" wp14:editId="14D367C6">
+                <wp:simplePos x="0" y="0"/>
+                <wp:positionH relativeFrom="column">
+                  <wp:posOffset>329565</wp:posOffset>
+                </wp:positionH>
+                <wp:positionV relativeFrom="paragraph">
+                  <wp:posOffset>748665</wp:posOffset>
+                </wp:positionV>
+                <wp:extent cx="381000" cy="114300"/>
+                <wp:effectExtent l="38100" t="0" r="19050" b="76200"/>
+                <wp:wrapNone/>
+                <wp:docPr id="457741640" name="Conector de Seta Reta 3"/>
+                <wp:cNvGraphicFramePr/>
+                <a:graphic xmlns:a="http://schemas.openxmlformats.org/drawingml/2006/main">
+                  <a:graphicData uri="http://schemas.microsoft.com/office/word/2010/wordprocessingShape">
+                    <wps:wsp>
+                      <wps:cNvCnPr/>
+                      <wps:spPr>
+                        <a:xfrm flipH="1">
+                          <a:off x="0" y="0"/>
+                          <a:ext cx="381000" cy="114300"/>
+                        </a:xfrm>
+                        <a:prstGeom prst="straightConnector1">
+                          <a:avLst/>
+                        </a:prstGeom>
+                        <a:ln>
+                          <a:solidFill>
+                            <a:srgbClr val="FF0000"/>
+                          </a:solidFill>
+                          <a:tailEnd type="triangle"/>
+                        </a:ln>
+                      </wps:spPr>
+                      <wps:style>
+                        <a:lnRef idx="2">
+                          <a:schemeClr val="accent1"/>
+                        </a:lnRef>
+                        <a:fillRef idx="0">
+                          <a:schemeClr val="accent1"/>
+                        </a:fillRef>
+                        <a:effectRef idx="1">
+                          <a:schemeClr val="accent1"/>
+                        </a:effectRef>
+                        <a:fontRef idx="minor">
+                          <a:schemeClr val="tx1"/>
+                        </a:fontRef>
+                      </wps:style>
+                      <wps:bodyPr/>
+                    </wps:wsp>
+                  </a:graphicData>
+                </a:graphic>
+              </wp:anchor>
+            </w:drawing>
+          </mc:Choice>
+          <mc:Fallback>
+            <w:pict>
+              <v:shape w14:anchorId="3F1BFDB3" id="Conector de Seta Reta 3" o:spid="_x0000_s1026" type="#_x0000_t32" style="position:absolute;margin-left:25.95pt;margin-top:58.95pt;width:30pt;height:9pt;flip:x;z-index:251660288;visibility:visible;mso-wrap-style:square;mso-wrap-distance-left:9pt;mso-wrap-distance-top:0;mso-wrap-distance-right:9pt;mso-wrap-distance-bottom:0;mso-position-horizontal:absolute;mso-position-horizontal-relative:text;mso-position-vertical:absolute;mso-position-vertical-relative:text" o:gfxdata="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" strokecolor="red" strokeweight="1.5pt">
+                <v:stroke endarrow="block" joinstyle="miter"/>
+              </v:shape>
+            </w:pict>
+          </mc:Fallback>
+        </mc:AlternateContent>
+      </w:r>
+      <w:r>
+        <w:rPr>
+          <w:noProof/>
+        </w:rPr>
         <w:drawing>
-          <wp:inline distT="0" distB="0" distL="0" distR="0" wp14:anchorId="32A6CCC4" wp14:editId="19261B67">
+          <wp:inline distT="0" distB="0" distL="0" distR="0" wp14:anchorId="32A6CCC4" wp14:editId="0225A37B">
             <wp:extent cx="4410075" cy="2474595"/>
             <wp:effectExtent l="0" t="0" r="9525" b="1905"/>
             <wp:docPr id="1666378407" name="Imagem 1" descr="Interface gráfica do usuário, Texto, Aplicativo, Email&#10;&#10;O conteúdo gerado por IA pode estar incorreto."/>
@@ -2368,7 +2595,7 @@
                     <pic:cNvPicPr/>
                   </pic:nvPicPr>
                   <pic:blipFill>
-                    <a:blip r:embed="rId21" cstate="print">
+                    <a:blip r:embed="rId22" cstate="print">
                       <a:extLst>
                         <a:ext uri="{28A0092B-C50C-407E-A947-70E740481C1C}">
                           <a14:useLocalDpi xmlns:a14="http://schemas.microsoft.com/office/drawing/2010/main" val="0"/>
@@ -2400,13 +2627,17 @@
         <w:spacing w:before="240" w:after="240"/>
         <w:rPr>
           <w:rFonts w:ascii="Aptos" w:eastAsia="Aptos" w:hAnsi="Aptos" w:cs="Aptos"/>
-        </w:rPr>
-      </w:pPr>
-      <w:r>
-        <w:rPr>
-          <w:rFonts w:ascii="Aptos" w:eastAsia="Aptos" w:hAnsi="Aptos" w:cs="Aptos"/>
-        </w:rPr>
-        <w:t>Ou</w:t>
+          <w:b/>
+          <w:bCs/>
+        </w:rPr>
+      </w:pPr>
+      <w:r>
+        <w:rPr>
+          <w:rFonts w:ascii="Aptos" w:eastAsia="Aptos" w:hAnsi="Aptos" w:cs="Aptos"/>
+          <w:b/>
+          <w:bCs/>
+        </w:rPr>
+        <w:t>c) Terceiro Jeito</w:t>
       </w:r>
     </w:p>
     <w:p>
@@ -2508,7 +2739,7 @@
                     <pic:cNvPicPr/>
                   </pic:nvPicPr>
                   <pic:blipFill>
-                    <a:blip r:embed="rId22"/>
+                    <a:blip r:embed="rId20"/>
                     <a:stretch>
                       <a:fillRect/>
                     </a:stretch>
@@ -2621,7 +2852,32 @@
           <w:b/>
           <w:bCs/>
         </w:rPr>
-        <w:t>3) Terceiro Jeito</w:t>
+        <w:lastRenderedPageBreak/>
+        <w:t>d</w:t>
+      </w:r>
+      <w:r>
+        <w:rPr>
+          <w:rFonts w:ascii="Aptos" w:eastAsia="Aptos" w:hAnsi="Aptos" w:cs="Aptos"/>
+          <w:b/>
+          <w:bCs/>
+        </w:rPr>
+        <w:t xml:space="preserve">) </w:t>
+      </w:r>
+      <w:r>
+        <w:rPr>
+          <w:rFonts w:ascii="Aptos" w:eastAsia="Aptos" w:hAnsi="Aptos" w:cs="Aptos"/>
+          <w:b/>
+          <w:bCs/>
+        </w:rPr>
+        <w:t>Quarto</w:t>
+      </w:r>
+      <w:r>
+        <w:rPr>
+          <w:rFonts w:ascii="Aptos" w:eastAsia="Aptos" w:hAnsi="Aptos" w:cs="Aptos"/>
+          <w:b/>
+          <w:bCs/>
+        </w:rPr>
+        <w:t xml:space="preserve"> Jeito</w:t>
       </w:r>
       <w:r>
         <w:rPr>
@@ -2648,7 +2904,6 @@
         <w:rPr>
           <w:rFonts w:ascii="Aptos" w:eastAsia="Aptos" w:hAnsi="Aptos" w:cs="Aptos"/>
         </w:rPr>
-        <w:lastRenderedPageBreak/>
         <w:t>Clicar no botão direito do mouse no arquivo que queremos mover</w:t>
       </w:r>
       <w:r>
@@ -3733,119 +3988,6 @@
     </w:lvl>
   </w:abstractNum>
   <w:abstractNum w:abstractNumId="7" w15:restartNumberingAfterBreak="0">
-    <w:nsid w:val="3AA167C4"/>
-    <w:multiLevelType w:val="hybridMultilevel"/>
-    <w:tmpl w:val="5122D85C"/>
-    <w:lvl w:ilvl="0" w:tplc="04160001">
-      <w:start w:val="1"/>
-      <w:numFmt w:val="bullet"/>
-      <w:lvlText w:val=""/>
-      <w:lvlJc w:val="left"/>
-      <w:pPr>
-        <w:ind w:left="720" w:hanging="360"/>
-      </w:pPr>
-      <w:rPr>
-        <w:rFonts w:ascii="Symbol" w:hAnsi="Symbol" w:hint="default"/>
-      </w:rPr>
-    </w:lvl>
-    <w:lvl w:ilvl="1" w:tplc="04160003" w:tentative="1">
-      <w:start w:val="1"/>
-      <w:numFmt w:val="bullet"/>
-      <w:lvlText w:val="o"/>
-      <w:lvlJc w:val="left"/>
-      <w:pPr>
-        <w:ind w:left="1440" w:hanging="360"/>
-      </w:pPr>
-      <w:rPr>
-        <w:rFonts w:ascii="Courier New" w:hAnsi="Courier New" w:cs="Courier New" w:hint="default"/>
-      </w:rPr>
-    </w:lvl>
-    <w:lvl w:ilvl="2" w:tplc="04160005" w:tentative="1">
-      <w:start w:val="1"/>
-      <w:numFmt w:val="bullet"/>
-      <w:lvlText w:val=""/>
-      <w:lvlJc w:val="left"/>
-      <w:pPr>
-        <w:ind w:left="2160" w:hanging="360"/>
-      </w:pPr>
-      <w:rPr>
-        <w:rFonts w:ascii="Wingdings" w:hAnsi="Wingdings" w:hint="default"/>
-      </w:rPr>
-    </w:lvl>
-    <w:lvl w:ilvl="3" w:tplc="04160001" w:tentative="1">
-      <w:start w:val="1"/>
-      <w:numFmt w:val="bullet"/>
-      <w:lvlText w:val=""/>
-      <w:lvlJc w:val="left"/>
-      <w:pPr>
-        <w:ind w:left="2880" w:hanging="360"/>
-      </w:pPr>
-      <w:rPr>
-        <w:rFonts w:ascii="Symbol" w:hAnsi="Symbol" w:hint="default"/>
-      </w:rPr>
-    </w:lvl>
-    <w:lvl w:ilvl="4" w:tplc="04160003" w:tentative="1">
-      <w:start w:val="1"/>
-      <w:numFmt w:val="bullet"/>
-      <w:lvlText w:val="o"/>
-      <w:lvlJc w:val="left"/>
-      <w:pPr>
-        <w:ind w:left="3600" w:hanging="360"/>
-      </w:pPr>
-      <w:rPr>
-        <w:rFonts w:ascii="Courier New" w:hAnsi="Courier New" w:cs="Courier New" w:hint="default"/>
-      </w:rPr>
-    </w:lvl>
-    <w:lvl w:ilvl="5" w:tplc="04160005" w:tentative="1">
-      <w:start w:val="1"/>
-      <w:numFmt w:val="bullet"/>
-      <w:lvlText w:val=""/>
-      <w:lvlJc w:val="left"/>
-      <w:pPr>
-        <w:ind w:left="4320" w:hanging="360"/>
-      </w:pPr>
-      <w:rPr>
-        <w:rFonts w:ascii="Wingdings" w:hAnsi="Wingdings" w:hint="default"/>
-      </w:rPr>
-    </w:lvl>
-    <w:lvl w:ilvl="6" w:tplc="04160001" w:tentative="1">
-      <w:start w:val="1"/>
-      <w:numFmt w:val="bullet"/>
-      <w:lvlText w:val=""/>
-      <w:lvlJc w:val="left"/>
-      <w:pPr>
-        <w:ind w:left="5040" w:hanging="360"/>
-      </w:pPr>
-      <w:rPr>
-        <w:rFonts w:ascii="Symbol" w:hAnsi="Symbol" w:hint="default"/>
-      </w:rPr>
-    </w:lvl>
-    <w:lvl w:ilvl="7" w:tplc="04160003" w:tentative="1">
-      <w:start w:val="1"/>
-      <w:numFmt w:val="bullet"/>
-      <w:lvlText w:val="o"/>
-      <w:lvlJc w:val="left"/>
-      <w:pPr>
-        <w:ind w:left="5760" w:hanging="360"/>
-      </w:pPr>
-      <w:rPr>
-        <w:rFonts w:ascii="Courier New" w:hAnsi="Courier New" w:cs="Courier New" w:hint="default"/>
-      </w:rPr>
-    </w:lvl>
-    <w:lvl w:ilvl="8" w:tplc="04160005" w:tentative="1">
-      <w:start w:val="1"/>
-      <w:numFmt w:val="bullet"/>
-      <w:lvlText w:val=""/>
-      <w:lvlJc w:val="left"/>
-      <w:pPr>
-        <w:ind w:left="6480" w:hanging="360"/>
-      </w:pPr>
-      <w:rPr>
-        <w:rFonts w:ascii="Wingdings" w:hAnsi="Wingdings" w:hint="default"/>
-      </w:rPr>
-    </w:lvl>
-  </w:abstractNum>
-  <w:abstractNum w:abstractNumId="8" w15:restartNumberingAfterBreak="0">
     <w:nsid w:val="3E32E1D2"/>
     <w:multiLevelType w:val="hybridMultilevel"/>
     <w:tmpl w:val="FFFFFFFF"/>
@@ -3958,7 +4100,7 @@
       </w:rPr>
     </w:lvl>
   </w:abstractNum>
-  <w:abstractNum w:abstractNumId="9" w15:restartNumberingAfterBreak="0">
+  <w:abstractNum w:abstractNumId="8" w15:restartNumberingAfterBreak="0">
     <w:nsid w:val="43850A2D"/>
     <w:multiLevelType w:val="hybridMultilevel"/>
     <w:tmpl w:val="7DFA7000"/>
@@ -4071,7 +4213,7 @@
       </w:rPr>
     </w:lvl>
   </w:abstractNum>
-  <w:abstractNum w:abstractNumId="10" w15:restartNumberingAfterBreak="0">
+  <w:abstractNum w:abstractNumId="9" w15:restartNumberingAfterBreak="0">
     <w:nsid w:val="5E2ACDBE"/>
     <w:multiLevelType w:val="hybridMultilevel"/>
     <w:tmpl w:val="FFFFFFFF"/>
@@ -4184,7 +4326,7 @@
       </w:rPr>
     </w:lvl>
   </w:abstractNum>
-  <w:abstractNum w:abstractNumId="11" w15:restartNumberingAfterBreak="0">
+  <w:abstractNum w:abstractNumId="10" w15:restartNumberingAfterBreak="0">
     <w:nsid w:val="5FC46D70"/>
     <w:multiLevelType w:val="hybridMultilevel"/>
     <w:tmpl w:val="FFFFFFFF"/>
@@ -4297,7 +4439,7 @@
       </w:rPr>
     </w:lvl>
   </w:abstractNum>
-  <w:abstractNum w:abstractNumId="12" w15:restartNumberingAfterBreak="0">
+  <w:abstractNum w:abstractNumId="11" w15:restartNumberingAfterBreak="0">
     <w:nsid w:val="60AF0169"/>
     <w:multiLevelType w:val="hybridMultilevel"/>
     <w:tmpl w:val="FFFFFFFF"/>
@@ -4410,7 +4552,7 @@
       </w:rPr>
     </w:lvl>
   </w:abstractNum>
-  <w:abstractNum w:abstractNumId="13" w15:restartNumberingAfterBreak="0">
+  <w:abstractNum w:abstractNumId="12" w15:restartNumberingAfterBreak="0">
     <w:nsid w:val="6B8E7AC1"/>
     <w:multiLevelType w:val="hybridMultilevel"/>
     <w:tmpl w:val="C5BC5350"/>
@@ -4499,7 +4641,7 @@
       </w:pPr>
     </w:lvl>
   </w:abstractNum>
-  <w:abstractNum w:abstractNumId="14" w15:restartNumberingAfterBreak="0">
+  <w:abstractNum w:abstractNumId="13" w15:restartNumberingAfterBreak="0">
     <w:nsid w:val="71EA9CDF"/>
     <w:multiLevelType w:val="hybridMultilevel"/>
     <w:tmpl w:val="FFFFFFFF"/>
@@ -4612,7 +4754,7 @@
       </w:rPr>
     </w:lvl>
   </w:abstractNum>
-  <w:abstractNum w:abstractNumId="15" w15:restartNumberingAfterBreak="0">
+  <w:abstractNum w:abstractNumId="14" w15:restartNumberingAfterBreak="0">
     <w:nsid w:val="7BCDC272"/>
     <w:multiLevelType w:val="hybridMultilevel"/>
     <w:tmpl w:val="FFFFFFFF"/>
@@ -4732,19 +4874,19 @@
     <w:abstractNumId w:val="5"/>
   </w:num>
   <w:num w:numId="3" w16cid:durableId="1998342493">
-    <w:abstractNumId w:val="9"/>
+    <w:abstractNumId w:val="8"/>
   </w:num>
   <w:num w:numId="4" w16cid:durableId="576400235">
     <w:abstractNumId w:val="6"/>
   </w:num>
   <w:num w:numId="5" w16cid:durableId="170685154">
-    <w:abstractNumId w:val="15"/>
+    <w:abstractNumId w:val="14"/>
   </w:num>
   <w:num w:numId="6" w16cid:durableId="1329215892">
-    <w:abstractNumId w:val="10"/>
+    <w:abstractNumId w:val="9"/>
   </w:num>
   <w:num w:numId="7" w16cid:durableId="1470438711">
-    <w:abstractNumId w:val="8"/>
+    <w:abstractNumId w:val="7"/>
   </w:num>
   <w:num w:numId="8" w16cid:durableId="72359013">
     <w:abstractNumId w:val="0"/>
@@ -4753,25 +4895,22 @@
     <w:abstractNumId w:val="1"/>
   </w:num>
   <w:num w:numId="10" w16cid:durableId="2119832224">
-    <w:abstractNumId w:val="12"/>
+    <w:abstractNumId w:val="11"/>
   </w:num>
   <w:num w:numId="11" w16cid:durableId="1289313352">
-    <w:abstractNumId w:val="14"/>
+    <w:abstractNumId w:val="13"/>
   </w:num>
   <w:num w:numId="12" w16cid:durableId="48653080">
-    <w:abstractNumId w:val="11"/>
+    <w:abstractNumId w:val="10"/>
   </w:num>
   <w:num w:numId="13" w16cid:durableId="141235703">
-    <w:abstractNumId w:val="13"/>
+    <w:abstractNumId w:val="12"/>
   </w:num>
   <w:num w:numId="14" w16cid:durableId="576666708">
     <w:abstractNumId w:val="4"/>
   </w:num>
   <w:num w:numId="15" w16cid:durableId="1441072201">
     <w:abstractNumId w:val="3"/>
-  </w:num>
-  <w:num w:numId="16" w16cid:durableId="453250890">
-    <w:abstractNumId w:val="7"/>
   </w:num>
 </w:numbering>
 </file>

</xml_diff>